<commit_message>
Agrego los usuarios de prueba, los scripts SQL y el diccionario del sistema construido, y unifico las claves de la API
</commit_message>
<xml_diff>
--- a/docs/diseno/INVENTRA_MER_MR_Diccionario.docx
+++ b/docs/diseno/INVENTRA_MER_MR_Diccionario.docx
@@ -1907,6 +1907,45 @@
       </w:pPr>
       <w:r>
         <w:t xml:space="preserve">Aislamiento multiempresa: las tablas de negocio llevan licorera_id; toda consulta del sistema filtra por ese campo.</w:t>
+      </w:r>
+    </w:p>
+    <w:p>
+      <w:pPr>
+        <w:pStyle w:val="Prrafodelista"/>
+        <w:numPr>
+          <w:ilvl w:val="0"/>
+          <w:numId w:val="2"/>
+        </w:numPr>
+        <w:spacing w:after="80"/>
+      </w:pPr>
+      <w:r>
+        <w:t xml:space="preserve">Materialización de los tipos: las llaves primarias y foráneas se crean como BIGINT, que es el tipo que aplica el marco de trabajo a los identificadores automáticos para no agotar el rango en tablas de crecimiento continuo (kardex, ventas). Una llave foránea adopta el tipo de la llave a la que apunta, de modo que la convención se propaga a todo el modelo.</w:t>
+      </w:r>
+    </w:p>
+    <w:p>
+      <w:pPr>
+        <w:pStyle w:val="Prrafodelista"/>
+        <w:numPr>
+          <w:ilvl w:val="0"/>
+          <w:numId w:val="2"/>
+        </w:numPr>
+        <w:spacing w:after="80"/>
+      </w:pPr>
+      <w:r>
+        <w:t xml:space="preserve">Las columnas de lista cerrada descritas en este documento como ENUM se materializan como VARCHAR con la lista de valores válidos comprobada en la aplicación: alterar un ENUM en MySQL obliga a reescribir la tabla completa y no es portable entre motores. El comportamiento para el usuario es el mismo y permite incorporar un valor nuevo con una migración sencilla.</w:t>
+      </w:r>
+    </w:p>
+    <w:p>
+      <w:pPr>
+        <w:pStyle w:val="Prrafodelista"/>
+        <w:numPr>
+          <w:ilvl w:val="0"/>
+          <w:numId w:val="2"/>
+        </w:numPr>
+        <w:spacing w:after="80"/>
+      </w:pPr>
+      <w:r>
+        <w:t xml:space="preserve">El detalle columna por columna de las tablas ya construidas, con su tipo real, está en el anexo INVENTRA_Diccionario_Datos_Construido.md, que se genera desde los modelos del proyecto y por tanto no puede contradecir a la base de datos.</w:t>
       </w:r>
     </w:p>
     <w:p>

</xml_diff>